<commit_message>
feat: two-tier permissions — Admin role vs Agent role
- New isAdmin() (Discord Administrator/Manage Server OR a configured admin role)
  and isSupportMember() = admin or agent role.
- Admin-only: /setup, /config, /ticket-panel, /stats, /assign (gated in-handler
  by isAdmin; dropped ManageGuild default so a configured admin role works too).
- Agent-level (unchanged commands, now include admins): claim, close, /solved,
  /internal, add/remove-user, /ticket-info, /reopen, /usernote.
- Config: new admin_role_ids column (schema + types + writable/JSONB sets);
  /config add-admin-role / remove-admin-role; config view shows both tiers.
- /setup now provisions BOTH a Support Admins and a Support Agents role, wires
  both into config, and grants both access to the staff channels.

Note: PGSSL stays optional — only for a remote DB; not used by the compose stack.

Co-Authored-By: Claude Opus 4.8 (1M context) <noreply@anthropic.com>
</commit_message>
<xml_diff>
--- a/Setup-Guide.docx
+++ b/Setup-Guide.docx
@@ -1670,7 +1670,7 @@
         <w:pStyle w:val="Heading1"/>
       </w:pPr>
       <w:r>
-        <w:t xml:space="preserve">5. Channels &amp; Roles to Create</w:t>
+        <w:t xml:space="preserve">5. Channels &amp; Roles</w:t>
       </w:r>
     </w:p>
     <w:p>
@@ -1678,7 +1678,19 @@
         <w:spacing w:after="120"/>
       </w:pPr>
       <w:r>
-        <w:t xml:space="preserve">Create the following once. The bot creates the "Closed Tickets" archive category automatically.</w:t>
+        <w:rPr>
+          <w:b/>
+          <w:bCs/>
+        </w:rPr>
+        <w:t xml:space="preserve">Recommended: run /setup once (administrator only) and the bot creates all of the following with the correct, private permissions — including a read-only panel channel and a staff-only log channel. You can also create them manually as described below.</w:t>
+      </w:r>
+    </w:p>
+    <w:p>
+      <w:pPr>
+        <w:spacing w:after="120"/>
+      </w:pPr>
+      <w:r>
+        <w:t xml:space="preserve">The only manual step that always remains: assign the support role to your agents. Creating channels is safe to automate; deciding who is staff is an authorization decision that stays with an admin.</w:t>
       </w:r>
     </w:p>
     <w:tbl>
@@ -1849,7 +1861,7 @@
                 <w:sz w:val="20"/>
                 <w:szCs w:val="20"/>
               </w:rPr>
-              <w:t xml:space="preserve">Support Team</w:t>
+              <w:t xml:space="preserve">Support Admins</w:t>
             </w:r>
           </w:p>
         </w:tc>
@@ -1905,7 +1917,7 @@
                 <w:sz w:val="20"/>
                 <w:szCs w:val="20"/>
               </w:rPr>
-              <w:t xml:space="preserve">Defines who counts as staff (set via /config)</w:t>
+              <w:t xml:space="preserve">Admin access: /setup, /config, /ticket-panel, /stats, /assign</w:t>
             </w:r>
           </w:p>
         </w:tc>
@@ -1933,7 +1945,7 @@
                 <w:sz w:val="20"/>
                 <w:szCs w:val="20"/>
               </w:rPr>
-              <w:t xml:space="preserve">Assigned to agents</w:t>
+              <w:t xml:space="preserve">Assigned to leads</w:t>
             </w:r>
           </w:p>
         </w:tc>
@@ -1963,7 +1975,7 @@
                 <w:sz w:val="20"/>
                 <w:szCs w:val="20"/>
               </w:rPr>
-              <w:t xml:space="preserve">Tickets</w:t>
+              <w:t xml:space="preserve">Support Agents</w:t>
             </w:r>
           </w:p>
         </w:tc>
@@ -1991,7 +2003,7 @@
                 <w:sz w:val="20"/>
                 <w:szCs w:val="20"/>
               </w:rPr>
-              <w:t xml:space="preserve">Category</w:t>
+              <w:t xml:space="preserve">Role</w:t>
             </w:r>
           </w:p>
         </w:tc>
@@ -2019,7 +2031,7 @@
                 <w:sz w:val="20"/>
                 <w:szCs w:val="20"/>
               </w:rPr>
-              <w:t xml:space="preserve">Parent category where active ticket channels are created</w:t>
+              <w:t xml:space="preserve">Agent access: work tickets (claim, close, notes, etc.)</w:t>
             </w:r>
           </w:p>
         </w:tc>
@@ -2047,7 +2059,7 @@
                 <w:sz w:val="20"/>
                 <w:szCs w:val="20"/>
               </w:rPr>
-              <w:t xml:space="preserve">Staff + each ticket owner</w:t>
+              <w:t xml:space="preserve">Assigned to agents</w:t>
             </w:r>
           </w:p>
         </w:tc>
@@ -2077,7 +2089,7 @@
                 <w:sz w:val="20"/>
                 <w:szCs w:val="20"/>
               </w:rPr>
-              <w:t xml:space="preserve">#create-ticket</w:t>
+              <w:t xml:space="preserve">Tickets</w:t>
             </w:r>
           </w:p>
         </w:tc>
@@ -2105,7 +2117,7 @@
                 <w:sz w:val="20"/>
                 <w:szCs w:val="20"/>
               </w:rPr>
-              <w:t xml:space="preserve">Text channel</w:t>
+              <w:t xml:space="preserve">Category</w:t>
             </w:r>
           </w:p>
         </w:tc>
@@ -2133,7 +2145,7 @@
                 <w:sz w:val="20"/>
                 <w:szCs w:val="20"/>
               </w:rPr>
-              <w:t xml:space="preserve">Holds the panel; members click to open a ticket</w:t>
+              <w:t xml:space="preserve">Parent category where active ticket channels are created</w:t>
             </w:r>
           </w:p>
         </w:tc>
@@ -2161,7 +2173,7 @@
                 <w:sz w:val="20"/>
                 <w:szCs w:val="20"/>
               </w:rPr>
-              <w:t xml:space="preserve">Everyone (view)</w:t>
+              <w:t xml:space="preserve">Staff + each ticket owner</w:t>
             </w:r>
           </w:p>
         </w:tc>
@@ -2191,7 +2203,7 @@
                 <w:sz w:val="20"/>
                 <w:szCs w:val="20"/>
               </w:rPr>
-              <w:t xml:space="preserve">#ticket-logs</w:t>
+              <w:t xml:space="preserve">#create-ticket</w:t>
             </w:r>
           </w:p>
         </w:tc>
@@ -2247,7 +2259,7 @@
                 <w:sz w:val="20"/>
                 <w:szCs w:val="20"/>
               </w:rPr>
-              <w:t xml:space="preserve">Close logs, transcripts, internal-note records</w:t>
+              <w:t xml:space="preserve">Holds the panel; members click to open a ticket</w:t>
             </w:r>
           </w:p>
         </w:tc>
@@ -2275,7 +2287,7 @@
                 <w:sz w:val="20"/>
                 <w:szCs w:val="20"/>
               </w:rPr>
-              <w:t xml:space="preserve">Staff only (NOT everyone)</w:t>
+              <w:t xml:space="preserve">Everyone (view)</w:t>
             </w:r>
           </w:p>
         </w:tc>
@@ -2305,6 +2317,120 @@
                 <w:sz w:val="20"/>
                 <w:szCs w:val="20"/>
               </w:rPr>
+              <w:t xml:space="preserve">#ticket-logs</w:t>
+            </w:r>
+          </w:p>
+        </w:tc>
+        <w:tc>
+          <w:tcPr>
+            <w:tcW w:type="dxa" w:w="1500"/>
+            <w:tcBorders>
+              <w:top w:val="single" w:color="CCCCCC" w:sz="1"/>
+              <w:left w:val="single" w:color="CCCCCC" w:sz="1"/>
+              <w:bottom w:val="single" w:color="CCCCCC" w:sz="1"/>
+              <w:right w:val="single" w:color="CCCCCC" w:sz="1"/>
+            </w:tcBorders>
+            <w:shd w:fill="FFFFFF" w:val="clear"/>
+            <w:tcMar>
+              <w:top w:type="dxa" w:w="80"/>
+              <w:left w:type="dxa" w:w="120"/>
+              <w:bottom w:type="dxa" w:w="80"/>
+              <w:right w:type="dxa" w:w="120"/>
+            </w:tcMar>
+          </w:tcPr>
+          <w:p>
+            <w:r>
+              <w:rPr>
+                <w:color w:val="000000"/>
+                <w:sz w:val="20"/>
+                <w:szCs w:val="20"/>
+              </w:rPr>
+              <w:t xml:space="preserve">Text channel</w:t>
+            </w:r>
+          </w:p>
+        </w:tc>
+        <w:tc>
+          <w:tcPr>
+            <w:tcW w:type="dxa" w:w="3560"/>
+            <w:tcBorders>
+              <w:top w:val="single" w:color="CCCCCC" w:sz="1"/>
+              <w:left w:val="single" w:color="CCCCCC" w:sz="1"/>
+              <w:bottom w:val="single" w:color="CCCCCC" w:sz="1"/>
+              <w:right w:val="single" w:color="CCCCCC" w:sz="1"/>
+            </w:tcBorders>
+            <w:shd w:fill="FFFFFF" w:val="clear"/>
+            <w:tcMar>
+              <w:top w:type="dxa" w:w="80"/>
+              <w:left w:type="dxa" w:w="120"/>
+              <w:bottom w:type="dxa" w:w="80"/>
+              <w:right w:type="dxa" w:w="120"/>
+            </w:tcMar>
+          </w:tcPr>
+          <w:p>
+            <w:r>
+              <w:rPr>
+                <w:color w:val="000000"/>
+                <w:sz w:val="20"/>
+                <w:szCs w:val="20"/>
+              </w:rPr>
+              <w:t xml:space="preserve">Close logs, transcripts, internal-note records</w:t>
+            </w:r>
+          </w:p>
+        </w:tc>
+        <w:tc>
+          <w:tcPr>
+            <w:tcW w:type="dxa" w:w="2200"/>
+            <w:tcBorders>
+              <w:top w:val="single" w:color="CCCCCC" w:sz="1"/>
+              <w:left w:val="single" w:color="CCCCCC" w:sz="1"/>
+              <w:bottom w:val="single" w:color="CCCCCC" w:sz="1"/>
+              <w:right w:val="single" w:color="CCCCCC" w:sz="1"/>
+            </w:tcBorders>
+            <w:shd w:fill="FFFFFF" w:val="clear"/>
+            <w:tcMar>
+              <w:top w:type="dxa" w:w="80"/>
+              <w:left w:type="dxa" w:w="120"/>
+              <w:bottom w:type="dxa" w:w="80"/>
+              <w:right w:type="dxa" w:w="120"/>
+            </w:tcMar>
+          </w:tcPr>
+          <w:p>
+            <w:r>
+              <w:rPr>
+                <w:color w:val="000000"/>
+                <w:sz w:val="20"/>
+                <w:szCs w:val="20"/>
+              </w:rPr>
+              <w:t xml:space="preserve">Staff only (NOT everyone)</w:t>
+            </w:r>
+          </w:p>
+        </w:tc>
+      </w:tr>
+      <w:tr>
+        <w:tc>
+          <w:tcPr>
+            <w:tcW w:type="dxa" w:w="2100"/>
+            <w:tcBorders>
+              <w:top w:val="single" w:color="CCCCCC" w:sz="1"/>
+              <w:left w:val="single" w:color="CCCCCC" w:sz="1"/>
+              <w:bottom w:val="single" w:color="CCCCCC" w:sz="1"/>
+              <w:right w:val="single" w:color="CCCCCC" w:sz="1"/>
+            </w:tcBorders>
+            <w:shd w:fill="F2F6FB" w:val="clear"/>
+            <w:tcMar>
+              <w:top w:type="dxa" w:w="80"/>
+              <w:left w:type="dxa" w:w="120"/>
+              <w:bottom w:type="dxa" w:w="80"/>
+              <w:right w:type="dxa" w:w="120"/>
+            </w:tcMar>
+          </w:tcPr>
+          <w:p>
+            <w:r>
+              <w:rPr>
+                <w:color w:val="000000"/>
+                <w:sz w:val="20"/>
+                <w:szCs w:val="20"/>
+              </w:rPr>
               <w:t xml:space="preserve">Closed Tickets</w:t>
             </w:r>
           </w:p>
@@ -2318,7 +2444,7 @@
               <w:bottom w:val="single" w:color="CCCCCC" w:sz="1"/>
               <w:right w:val="single" w:color="CCCCCC" w:sz="1"/>
             </w:tcBorders>
-            <w:shd w:fill="FFFFFF" w:val="clear"/>
+            <w:shd w:fill="F2F6FB" w:val="clear"/>
             <w:tcMar>
               <w:top w:type="dxa" w:w="80"/>
               <w:left w:type="dxa" w:w="120"/>
@@ -2346,7 +2472,7 @@
               <w:bottom w:val="single" w:color="CCCCCC" w:sz="1"/>
               <w:right w:val="single" w:color="CCCCCC" w:sz="1"/>
             </w:tcBorders>
-            <w:shd w:fill="FFFFFF" w:val="clear"/>
+            <w:shd w:fill="F2F6FB" w:val="clear"/>
             <w:tcMar>
               <w:top w:type="dxa" w:w="80"/>
               <w:left w:type="dxa" w:w="120"/>
@@ -2374,7 +2500,7 @@
               <w:bottom w:val="single" w:color="CCCCCC" w:sz="1"/>
               <w:right w:val="single" w:color="CCCCCC" w:sz="1"/>
             </w:tcBorders>
-            <w:shd w:fill="FFFFFF" w:val="clear"/>
+            <w:shd w:fill="F2F6FB" w:val="clear"/>
             <w:tcMar>
               <w:top w:type="dxa" w:w="80"/>
               <w:left w:type="dxa" w:w="120"/>
@@ -2407,6 +2533,307 @@
         <w:t xml:space="preserve">Important: #ticket-logs must NOT be visible to @everyone — it receives full transcripts. The bot will refuse to use a log channel that everyone can read.</w:t>
       </w:r>
     </w:p>
+    <w:p>
+      <w:pPr>
+        <w:pStyle w:val="Heading2"/>
+      </w:pPr>
+      <w:r>
+        <w:t xml:space="preserve">Two permission tiers</w:t>
+      </w:r>
+    </w:p>
+    <w:p>
+      <w:pPr>
+        <w:spacing w:after="120"/>
+      </w:pPr>
+      <w:r>
+        <w:t xml:space="preserve">Access is split into Admin and Agent. Discord server administrators (Administrator / Manage Server) are always treated as Admin. Membership in these roles is assigned manually by an admin.</w:t>
+      </w:r>
+    </w:p>
+    <w:tbl>
+      <w:tblPr>
+        <w:tblW w:type="dxa" w:w="9360"/>
+        <w:tblBorders>
+          <w:top w:val="single" w:color="auto" w:sz="4"/>
+          <w:left w:val="single" w:color="auto" w:sz="4"/>
+          <w:bottom w:val="single" w:color="auto" w:sz="4"/>
+          <w:right w:val="single" w:color="auto" w:sz="4"/>
+          <w:insideH w:val="single" w:color="auto" w:sz="4"/>
+          <w:insideV w:val="single" w:color="auto" w:sz="4"/>
+        </w:tblBorders>
+      </w:tblPr>
+      <w:tblGrid>
+        <w:gridCol w:w="1500"/>
+        <w:gridCol w:w="3300"/>
+        <w:gridCol w:w="4560"/>
+      </w:tblGrid>
+      <w:tr>
+        <w:trPr>
+          <w:tblHeader/>
+        </w:trPr>
+        <w:tc>
+          <w:tcPr>
+            <w:tcW w:type="dxa" w:w="1500"/>
+            <w:tcBorders>
+              <w:top w:val="single" w:color="CCCCCC" w:sz="1"/>
+              <w:left w:val="single" w:color="CCCCCC" w:sz="1"/>
+              <w:bottom w:val="single" w:color="CCCCCC" w:sz="1"/>
+              <w:right w:val="single" w:color="CCCCCC" w:sz="1"/>
+            </w:tcBorders>
+            <w:shd w:fill="1F4E79" w:val="clear"/>
+            <w:tcMar>
+              <w:top w:type="dxa" w:w="80"/>
+              <w:left w:type="dxa" w:w="120"/>
+              <w:bottom w:type="dxa" w:w="80"/>
+              <w:right w:type="dxa" w:w="120"/>
+            </w:tcMar>
+          </w:tcPr>
+          <w:p>
+            <w:r>
+              <w:rPr>
+                <w:b/>
+                <w:bCs/>
+                <w:color w:val="FFFFFF"/>
+                <w:sz w:val="20"/>
+                <w:szCs w:val="20"/>
+              </w:rPr>
+              <w:t xml:space="preserve">Tier</w:t>
+            </w:r>
+          </w:p>
+        </w:tc>
+        <w:tc>
+          <w:tcPr>
+            <w:tcW w:type="dxa" w:w="3300"/>
+            <w:tcBorders>
+              <w:top w:val="single" w:color="CCCCCC" w:sz="1"/>
+              <w:left w:val="single" w:color="CCCCCC" w:sz="1"/>
+              <w:bottom w:val="single" w:color="CCCCCC" w:sz="1"/>
+              <w:right w:val="single" w:color="CCCCCC" w:sz="1"/>
+            </w:tcBorders>
+            <w:shd w:fill="1F4E79" w:val="clear"/>
+            <w:tcMar>
+              <w:top w:type="dxa" w:w="80"/>
+              <w:left w:type="dxa" w:w="120"/>
+              <w:bottom w:type="dxa" w:w="80"/>
+              <w:right w:type="dxa" w:w="120"/>
+            </w:tcMar>
+          </w:tcPr>
+          <w:p>
+            <w:r>
+              <w:rPr>
+                <w:b/>
+                <w:bCs/>
+                <w:color w:val="FFFFFF"/>
+                <w:sz w:val="20"/>
+                <w:szCs w:val="20"/>
+              </w:rPr>
+              <w:t xml:space="preserve">Who</w:t>
+            </w:r>
+          </w:p>
+        </w:tc>
+        <w:tc>
+          <w:tcPr>
+            <w:tcW w:type="dxa" w:w="4560"/>
+            <w:tcBorders>
+              <w:top w:val="single" w:color="CCCCCC" w:sz="1"/>
+              <w:left w:val="single" w:color="CCCCCC" w:sz="1"/>
+              <w:bottom w:val="single" w:color="CCCCCC" w:sz="1"/>
+              <w:right w:val="single" w:color="CCCCCC" w:sz="1"/>
+            </w:tcBorders>
+            <w:shd w:fill="1F4E79" w:val="clear"/>
+            <w:tcMar>
+              <w:top w:type="dxa" w:w="80"/>
+              <w:left w:type="dxa" w:w="120"/>
+              <w:bottom w:type="dxa" w:w="80"/>
+              <w:right w:type="dxa" w:w="120"/>
+            </w:tcMar>
+          </w:tcPr>
+          <w:p>
+            <w:r>
+              <w:rPr>
+                <w:b/>
+                <w:bCs/>
+                <w:color w:val="FFFFFF"/>
+                <w:sz w:val="20"/>
+                <w:szCs w:val="20"/>
+              </w:rPr>
+              <w:t xml:space="preserve">What they can do</w:t>
+            </w:r>
+          </w:p>
+        </w:tc>
+      </w:tr>
+      <w:tr>
+        <w:tc>
+          <w:tcPr>
+            <w:tcW w:type="dxa" w:w="1500"/>
+            <w:tcBorders>
+              <w:top w:val="single" w:color="CCCCCC" w:sz="1"/>
+              <w:left w:val="single" w:color="CCCCCC" w:sz="1"/>
+              <w:bottom w:val="single" w:color="CCCCCC" w:sz="1"/>
+              <w:right w:val="single" w:color="CCCCCC" w:sz="1"/>
+            </w:tcBorders>
+            <w:shd w:fill="FFFFFF" w:val="clear"/>
+            <w:tcMar>
+              <w:top w:type="dxa" w:w="80"/>
+              <w:left w:type="dxa" w:w="120"/>
+              <w:bottom w:type="dxa" w:w="80"/>
+              <w:right w:type="dxa" w:w="120"/>
+            </w:tcMar>
+          </w:tcPr>
+          <w:p>
+            <w:r>
+              <w:rPr>
+                <w:color w:val="000000"/>
+                <w:sz w:val="20"/>
+                <w:szCs w:val="20"/>
+              </w:rPr>
+              <w:t xml:space="preserve">Admin</w:t>
+            </w:r>
+          </w:p>
+        </w:tc>
+        <w:tc>
+          <w:tcPr>
+            <w:tcW w:type="dxa" w:w="3300"/>
+            <w:tcBorders>
+              <w:top w:val="single" w:color="CCCCCC" w:sz="1"/>
+              <w:left w:val="single" w:color="CCCCCC" w:sz="1"/>
+              <w:bottom w:val="single" w:color="CCCCCC" w:sz="1"/>
+              <w:right w:val="single" w:color="CCCCCC" w:sz="1"/>
+            </w:tcBorders>
+            <w:shd w:fill="FFFFFF" w:val="clear"/>
+            <w:tcMar>
+              <w:top w:type="dxa" w:w="80"/>
+              <w:left w:type="dxa" w:w="120"/>
+              <w:bottom w:type="dxa" w:w="80"/>
+              <w:right w:type="dxa" w:w="120"/>
+            </w:tcMar>
+          </w:tcPr>
+          <w:p>
+            <w:r>
+              <w:rPr>
+                <w:color w:val="000000"/>
+                <w:sz w:val="20"/>
+                <w:szCs w:val="20"/>
+              </w:rPr>
+              <w:t xml:space="preserve">Server admins or the admin role</w:t>
+            </w:r>
+          </w:p>
+        </w:tc>
+        <w:tc>
+          <w:tcPr>
+            <w:tcW w:type="dxa" w:w="4560"/>
+            <w:tcBorders>
+              <w:top w:val="single" w:color="CCCCCC" w:sz="1"/>
+              <w:left w:val="single" w:color="CCCCCC" w:sz="1"/>
+              <w:bottom w:val="single" w:color="CCCCCC" w:sz="1"/>
+              <w:right w:val="single" w:color="CCCCCC" w:sz="1"/>
+            </w:tcBorders>
+            <w:shd w:fill="FFFFFF" w:val="clear"/>
+            <w:tcMar>
+              <w:top w:type="dxa" w:w="80"/>
+              <w:left w:type="dxa" w:w="120"/>
+              <w:bottom w:type="dxa" w:w="80"/>
+              <w:right w:type="dxa" w:w="120"/>
+            </w:tcMar>
+          </w:tcPr>
+          <w:p>
+            <w:r>
+              <w:rPr>
+                <w:color w:val="000000"/>
+                <w:sz w:val="20"/>
+                <w:szCs w:val="20"/>
+              </w:rPr>
+              <w:t xml:space="preserve">/setup, /config, /ticket-panel, /stats, /assign — plus everything an agent can</w:t>
+            </w:r>
+          </w:p>
+        </w:tc>
+      </w:tr>
+      <w:tr>
+        <w:tc>
+          <w:tcPr>
+            <w:tcW w:type="dxa" w:w="1500"/>
+            <w:tcBorders>
+              <w:top w:val="single" w:color="CCCCCC" w:sz="1"/>
+              <w:left w:val="single" w:color="CCCCCC" w:sz="1"/>
+              <w:bottom w:val="single" w:color="CCCCCC" w:sz="1"/>
+              <w:right w:val="single" w:color="CCCCCC" w:sz="1"/>
+            </w:tcBorders>
+            <w:shd w:fill="F2F6FB" w:val="clear"/>
+            <w:tcMar>
+              <w:top w:type="dxa" w:w="80"/>
+              <w:left w:type="dxa" w:w="120"/>
+              <w:bottom w:type="dxa" w:w="80"/>
+              <w:right w:type="dxa" w:w="120"/>
+            </w:tcMar>
+          </w:tcPr>
+          <w:p>
+            <w:r>
+              <w:rPr>
+                <w:color w:val="000000"/>
+                <w:sz w:val="20"/>
+                <w:szCs w:val="20"/>
+              </w:rPr>
+              <w:t xml:space="preserve">Agent</w:t>
+            </w:r>
+          </w:p>
+        </w:tc>
+        <w:tc>
+          <w:tcPr>
+            <w:tcW w:type="dxa" w:w="3300"/>
+            <w:tcBorders>
+              <w:top w:val="single" w:color="CCCCCC" w:sz="1"/>
+              <w:left w:val="single" w:color="CCCCCC" w:sz="1"/>
+              <w:bottom w:val="single" w:color="CCCCCC" w:sz="1"/>
+              <w:right w:val="single" w:color="CCCCCC" w:sz="1"/>
+            </w:tcBorders>
+            <w:shd w:fill="F2F6FB" w:val="clear"/>
+            <w:tcMar>
+              <w:top w:type="dxa" w:w="80"/>
+              <w:left w:type="dxa" w:w="120"/>
+              <w:bottom w:type="dxa" w:w="80"/>
+              <w:right w:type="dxa" w:w="120"/>
+            </w:tcMar>
+          </w:tcPr>
+          <w:p>
+            <w:r>
+              <w:rPr>
+                <w:color w:val="000000"/>
+                <w:sz w:val="20"/>
+                <w:szCs w:val="20"/>
+              </w:rPr>
+              <w:t xml:space="preserve">The support (agent) role</w:t>
+            </w:r>
+          </w:p>
+        </w:tc>
+        <w:tc>
+          <w:tcPr>
+            <w:tcW w:type="dxa" w:w="4560"/>
+            <w:tcBorders>
+              <w:top w:val="single" w:color="CCCCCC" w:sz="1"/>
+              <w:left w:val="single" w:color="CCCCCC" w:sz="1"/>
+              <w:bottom w:val="single" w:color="CCCCCC" w:sz="1"/>
+              <w:right w:val="single" w:color="CCCCCC" w:sz="1"/>
+            </w:tcBorders>
+            <w:shd w:fill="F2F6FB" w:val="clear"/>
+            <w:tcMar>
+              <w:top w:type="dxa" w:w="80"/>
+              <w:left w:type="dxa" w:w="120"/>
+              <w:bottom w:type="dxa" w:w="80"/>
+              <w:right w:type="dxa" w:w="120"/>
+            </w:tcMar>
+          </w:tcPr>
+          <w:p>
+            <w:r>
+              <w:rPr>
+                <w:color w:val="000000"/>
+                <w:sz w:val="20"/>
+                <w:szCs w:val="20"/>
+              </w:rPr>
+              <w:t xml:space="preserve">claim, close, /solved, /internal, /add-user, /remove-user, /ticket-info, /reopen, /usernote</w:t>
+            </w:r>
+          </w:p>
+        </w:tc>
+      </w:tr>
+    </w:tbl>
     <w:p>
       <w:pPr>
         <w:pStyle w:val="Heading1"/>
@@ -3587,7 +4014,7 @@
                 <w:sz w:val="20"/>
                 <w:szCs w:val="20"/>
               </w:rPr>
-              <w:t xml:space="preserve">Set to "require" only when using a remote database over TLS</w:t>
+              <w:t xml:space="preserve">Not needed for the Docker Compose setup. Set to "require" only for a remote/managed Postgres over TLS</w:t>
             </w:r>
           </w:p>
         </w:tc>
@@ -3606,7 +4033,7 @@
         <w:spacing w:after="120"/>
       </w:pPr>
       <w:r>
-        <w:t xml:space="preserve">Run these slash commands once, as a server administrator:</w:t>
+        <w:t xml:space="preserve">Option A — automatic (recommended). As a server administrator, run:</w:t>
       </w:r>
     </w:p>
     <w:p>
@@ -3620,7 +4047,51 @@
           <w:sz w:val="19"/>
           <w:szCs w:val="19"/>
         </w:rPr>
-        <w:t xml:space="preserve">/config add-support-role role:@Support Team</w:t>
+        <w:t xml:space="preserve">/setup</w:t>
+      </w:r>
+    </w:p>
+    <w:p>
+      <w:pPr>
+        <w:spacing w:after="120"/>
+      </w:pPr>
+      <w:r>
+        <w:t xml:space="preserve">This creates the categories, channels and a Support Team role, wires the configuration, and posts the panel. Then assign that role to your agents.</w:t>
+      </w:r>
+    </w:p>
+    <w:p>
+      <w:pPr>
+        <w:spacing w:after="120"/>
+      </w:pPr>
+      <w:r>
+        <w:t xml:space="preserve">Option B — manual. If you created the channels yourself, wire them up:</w:t>
+      </w:r>
+    </w:p>
+    <w:p>
+      <w:pPr>
+        <w:shd w:fill="F2F2F2" w:val="clear"/>
+        <w:spacing w:after="60"/>
+      </w:pPr>
+      <w:r>
+        <w:rPr>
+          <w:rFonts w:ascii="Consolas" w:cs="Consolas" w:eastAsia="Consolas" w:hAnsi="Consolas"/>
+          <w:sz w:val="19"/>
+          <w:szCs w:val="19"/>
+        </w:rPr>
+        <w:t xml:space="preserve">/config add-admin-role role:@Support Admins</w:t>
+      </w:r>
+    </w:p>
+    <w:p>
+      <w:pPr>
+        <w:shd w:fill="F2F2F2" w:val="clear"/>
+        <w:spacing w:after="60"/>
+      </w:pPr>
+      <w:r>
+        <w:rPr>
+          <w:rFonts w:ascii="Consolas" w:cs="Consolas" w:eastAsia="Consolas" w:hAnsi="Consolas"/>
+          <w:sz w:val="19"/>
+          <w:szCs w:val="19"/>
+        </w:rPr>
+        <w:t xml:space="preserve">/config add-support-role role:@Support Agents</w:t>
       </w:r>
     </w:p>
     <w:p>
@@ -3663,14 +4134,6 @@
           <w:szCs w:val="19"/>
         </w:rPr>
         <w:t xml:space="preserve">/ticket-panel</w:t>
-      </w:r>
-    </w:p>
-    <w:p>
-      <w:pPr>
-        <w:spacing w:after="120"/>
-      </w:pPr>
-      <w:r>
-        <w:t xml:space="preserve">The panel posts an "Open a Ticket" button in the current channel (run /ticket-panel inside #create-ticket).</w:t>
       </w:r>
     </w:p>
     <w:p>

</xml_diff>